<commit_message>
feat: Documentação com capa
</commit_message>
<xml_diff>
--- a/Documentação.docx
+++ b/Documentação.docx
@@ -1,20 +1,948 @@
 
 <file path=word/document.xml><?xml version="1.0" encoding="utf-8"?>
-<w:document xmlns:wpc="http://schemas.microsoft.com/office/word/2010/wordprocessingCanvas" xmlns:cx="http://schemas.microsoft.com/office/drawing/2014/chartex" xmlns:mc="http://schemas.openxmlformats.org/markup-compatibility/2006" xmlns:o="urn:schemas-microsoft-com:office:office" xmlns:r="http://schemas.openxmlformats.org/officeDocument/2006/relationships" xmlns:m="http://schemas.openxmlformats.org/officeDocument/2006/math" xmlns:v="urn:schemas-microsoft-com:vml" xmlns:wp14="http://schemas.microsoft.com/office/word/2010/wordprocessingDrawing" xmlns:wp="http://schemas.openxmlformats.org/drawingml/2006/wordprocessingDrawing" xmlns:w10="urn:schemas-microsoft-com:office:word" xmlns:w="http://schemas.openxmlformats.org/wordprocessingml/2006/main" xmlns:w14="http://schemas.microsoft.com/office/word/2010/wordml" xmlns:w15="http://schemas.microsoft.com/office/word/2012/wordml" xmlns:w16se="http://schemas.microsoft.com/office/word/2015/wordml/symex" xmlns:wpg="http://schemas.microsoft.com/office/word/2010/wordprocessingGroup" xmlns:wpi="http://schemas.microsoft.com/office/word/2010/wordprocessingInk" xmlns:wne="http://schemas.microsoft.com/office/word/2006/wordml" xmlns:wps="http://schemas.microsoft.com/office/word/2010/wordprocessingShape" mc:Ignorable="w14 w15 w16se wp14">
+<w:document xmlns:wpc="http://schemas.microsoft.com/office/word/2010/wordprocessingCanvas" xmlns:cx="http://schemas.microsoft.com/office/drawing/2014/chartex" xmlns:cx1="http://schemas.microsoft.com/office/drawing/2015/9/8/chartex" xmlns:cx2="http://schemas.microsoft.com/office/drawing/2015/10/21/chartex" xmlns:cx3="http://schemas.microsoft.com/office/drawing/2016/5/9/chartex" xmlns:cx4="http://schemas.microsoft.com/office/drawing/2016/5/10/chartex" xmlns:cx5="http://schemas.microsoft.com/office/drawing/2016/5/11/chartex" xmlns:cx6="http://schemas.microsoft.com/office/drawing/2016/5/12/chartex" xmlns:cx7="http://schemas.microsoft.com/office/drawing/2016/5/13/chartex" xmlns:cx8="http://schemas.microsoft.com/office/drawing/2016/5/14/chartex" xmlns:mc="http://schemas.openxmlformats.org/markup-compatibility/2006" xmlns:aink="http://schemas.microsoft.com/office/drawing/2016/ink" xmlns:am3d="http://schemas.microsoft.com/office/drawing/2017/model3d" xmlns:o="urn:schemas-microsoft-com:office:office" xmlns:r="http://schemas.openxmlformats.org/officeDocument/2006/relationships" xmlns:m="http://schemas.openxmlformats.org/officeDocument/2006/math" xmlns:v="urn:schemas-microsoft-com:vml" xmlns:wp14="http://schemas.microsoft.com/office/word/2010/wordprocessingDrawing" xmlns:wp="http://schemas.openxmlformats.org/drawingml/2006/wordprocessingDrawing" xmlns:w10="urn:schemas-microsoft-com:office:word" xmlns:w="http://schemas.openxmlformats.org/wordprocessingml/2006/main" xmlns:w14="http://schemas.microsoft.com/office/word/2010/wordml" xmlns:w15="http://schemas.microsoft.com/office/word/2012/wordml" xmlns:w16cid="http://schemas.microsoft.com/office/word/2016/wordml/cid" xmlns:w16se="http://schemas.microsoft.com/office/word/2015/wordml/symex" xmlns:wpg="http://schemas.microsoft.com/office/word/2010/wordprocessingGroup" xmlns:wpi="http://schemas.microsoft.com/office/word/2010/wordprocessingInk" xmlns:wne="http://schemas.microsoft.com/office/word/2006/wordml" xmlns:wps="http://schemas.microsoft.com/office/word/2010/wordprocessingShape" mc:Ignorable="w14 w15 w16se w16cid wp14">
   <w:body>
     <w:p>
       <w:pPr>
-        <w:jc w:val="center"/>
-        <w:rPr>
-          <w:rFonts w:ascii="Arial" w:hAnsi="Arial" w:cs="Arial"/>
-          <w:sz w:val="24"/>
-        </w:rPr>
-      </w:pPr>
-      <w:r>
-        <w:rPr>
-          <w:rFonts w:ascii="Arial" w:hAnsi="Arial" w:cs="Arial"/>
-          <w:sz w:val="24"/>
-        </w:rPr>
+        <w:spacing w:after="0" w:line="360" w:lineRule="auto"/>
+        <w:jc w:val="center"/>
+        <w:rPr>
+          <w:rFonts w:ascii="Arial" w:hAnsi="Arial" w:cs="Arial"/>
+          <w:b/>
+          <w:sz w:val="28"/>
+          <w:szCs w:val="28"/>
+        </w:rPr>
+      </w:pPr>
+      <w:r>
+        <w:rPr>
+          <w:rFonts w:ascii="Arial" w:hAnsi="Arial" w:cs="Arial"/>
+          <w:b/>
+          <w:sz w:val="28"/>
+          <w:szCs w:val="28"/>
+        </w:rPr>
+        <w:t>CENTRO PAUL</w:t>
+      </w:r>
+      <w:r>
+        <w:rPr>
+          <w:rFonts w:ascii="Arial" w:hAnsi="Arial" w:cs="Arial"/>
+          <w:b/>
+          <w:sz w:val="28"/>
+          <w:szCs w:val="28"/>
+        </w:rPr>
+        <w:t>A</w:t>
+      </w:r>
+      <w:r>
+        <w:rPr>
+          <w:rFonts w:ascii="Arial" w:hAnsi="Arial" w:cs="Arial"/>
+          <w:b/>
+          <w:sz w:val="28"/>
+          <w:szCs w:val="28"/>
+        </w:rPr>
+        <w:t xml:space="preserve"> SOUZA</w:t>
+      </w:r>
+    </w:p>
+    <w:p>
+      <w:pPr>
+        <w:spacing w:after="0" w:line="360" w:lineRule="auto"/>
+        <w:jc w:val="center"/>
+        <w:rPr>
+          <w:rFonts w:ascii="Arial" w:hAnsi="Arial" w:cs="Arial"/>
+          <w:b/>
+          <w:sz w:val="28"/>
+          <w:szCs w:val="28"/>
+        </w:rPr>
+      </w:pPr>
+      <w:r>
+        <w:rPr>
+          <w:rFonts w:ascii="Arial" w:hAnsi="Arial" w:cs="Arial"/>
+          <w:b/>
+          <w:sz w:val="28"/>
+          <w:szCs w:val="28"/>
+        </w:rPr>
+        <w:t xml:space="preserve">ETEC </w:t>
+      </w:r>
+      <w:r>
+        <w:rPr>
+          <w:rFonts w:ascii="Arial" w:hAnsi="Arial" w:cs="Arial"/>
+          <w:b/>
+          <w:sz w:val="28"/>
+          <w:szCs w:val="28"/>
+        </w:rPr>
+        <w:t>PROFESSOR CAMARGO ARANHA</w:t>
+      </w:r>
+    </w:p>
+    <w:p>
+      <w:pPr>
+        <w:spacing w:after="0" w:line="360" w:lineRule="auto"/>
+        <w:jc w:val="center"/>
+        <w:rPr>
+          <w:rFonts w:ascii="Arial" w:hAnsi="Arial" w:cs="Arial"/>
+          <w:b/>
+          <w:sz w:val="28"/>
+          <w:szCs w:val="28"/>
+        </w:rPr>
+      </w:pPr>
+      <w:r>
+        <w:rPr>
+          <w:rFonts w:ascii="Arial" w:hAnsi="Arial" w:cs="Arial"/>
+          <w:b/>
+          <w:sz w:val="28"/>
+          <w:szCs w:val="28"/>
+        </w:rPr>
+        <w:t>Curso</w:t>
+      </w:r>
+      <w:r>
+        <w:rPr>
+          <w:rFonts w:ascii="Arial" w:hAnsi="Arial" w:cs="Arial"/>
+          <w:b/>
+          <w:sz w:val="28"/>
+          <w:szCs w:val="28"/>
+        </w:rPr>
+        <w:t xml:space="preserve"> técnico em</w:t>
+      </w:r>
+      <w:r>
+        <w:rPr>
+          <w:rFonts w:ascii="Arial" w:hAnsi="Arial" w:cs="Arial"/>
+          <w:b/>
+          <w:sz w:val="28"/>
+          <w:szCs w:val="28"/>
+        </w:rPr>
+        <w:t xml:space="preserve"> desenvolvimento de sistemas</w:t>
+      </w:r>
+    </w:p>
+    <w:p>
+      <w:pPr>
+        <w:spacing w:after="0" w:line="360" w:lineRule="auto"/>
+        <w:jc w:val="center"/>
+        <w:rPr>
+          <w:rFonts w:ascii="Arial" w:hAnsi="Arial" w:cs="Arial"/>
+          <w:sz w:val="28"/>
+          <w:szCs w:val="28"/>
+        </w:rPr>
+      </w:pPr>
+    </w:p>
+    <w:p>
+      <w:pPr>
+        <w:spacing w:after="0" w:line="360" w:lineRule="auto"/>
+        <w:jc w:val="center"/>
+        <w:rPr>
+          <w:rFonts w:ascii="Arial" w:hAnsi="Arial" w:cs="Arial"/>
+          <w:b/>
+          <w:sz w:val="28"/>
+          <w:szCs w:val="28"/>
+        </w:rPr>
+      </w:pPr>
+    </w:p>
+    <w:p>
+      <w:pPr>
+        <w:spacing w:after="0" w:line="360" w:lineRule="auto"/>
+        <w:jc w:val="center"/>
+        <w:rPr>
+          <w:rFonts w:ascii="Arial" w:hAnsi="Arial" w:cs="Arial"/>
+          <w:b/>
+          <w:sz w:val="28"/>
+          <w:szCs w:val="28"/>
+        </w:rPr>
+      </w:pPr>
+    </w:p>
+    <w:p>
+      <w:pPr>
+        <w:spacing w:after="0" w:line="360" w:lineRule="auto"/>
+        <w:jc w:val="center"/>
+        <w:rPr>
+          <w:rFonts w:ascii="Arial" w:hAnsi="Arial" w:cs="Arial"/>
+          <w:b/>
+          <w:sz w:val="28"/>
+          <w:szCs w:val="28"/>
+        </w:rPr>
+      </w:pPr>
+      <w:r>
+        <w:rPr>
+          <w:rFonts w:ascii="Arial" w:hAnsi="Arial" w:cs="Arial"/>
+          <w:b/>
+          <w:sz w:val="28"/>
+          <w:szCs w:val="28"/>
+        </w:rPr>
+        <w:t xml:space="preserve">Bryan Diego </w:t>
+      </w:r>
+      <w:proofErr w:type="spellStart"/>
+      <w:r>
+        <w:rPr>
+          <w:rFonts w:ascii="Arial" w:hAnsi="Arial" w:cs="Arial"/>
+          <w:b/>
+          <w:sz w:val="28"/>
+          <w:szCs w:val="28"/>
+        </w:rPr>
+        <w:t>Vino</w:t>
+      </w:r>
+      <w:proofErr w:type="spellEnd"/>
+      <w:r>
+        <w:rPr>
+          <w:rFonts w:ascii="Arial" w:hAnsi="Arial" w:cs="Arial"/>
+          <w:b/>
+          <w:sz w:val="28"/>
+          <w:szCs w:val="28"/>
+        </w:rPr>
+        <w:t xml:space="preserve"> </w:t>
+      </w:r>
+      <w:proofErr w:type="spellStart"/>
+      <w:r>
+        <w:rPr>
+          <w:rFonts w:ascii="Arial" w:hAnsi="Arial" w:cs="Arial"/>
+          <w:b/>
+          <w:sz w:val="28"/>
+          <w:szCs w:val="28"/>
+        </w:rPr>
+        <w:t>Lustri</w:t>
+      </w:r>
+      <w:proofErr w:type="spellEnd"/>
+      <w:r>
+        <w:rPr>
+          <w:rFonts w:ascii="Arial" w:hAnsi="Arial" w:cs="Arial"/>
+          <w:b/>
+          <w:sz w:val="28"/>
+          <w:szCs w:val="28"/>
+        </w:rPr>
+        <w:br/>
+      </w:r>
+      <w:r>
+        <w:rPr>
+          <w:rFonts w:ascii="Arial" w:hAnsi="Arial" w:cs="Arial"/>
+          <w:b/>
+          <w:sz w:val="28"/>
+          <w:szCs w:val="28"/>
+        </w:rPr>
+        <w:t>Davi Tavares Nascimento Bess</w:t>
+      </w:r>
+      <w:r>
+        <w:rPr>
+          <w:rFonts w:ascii="Arial" w:hAnsi="Arial" w:cs="Arial"/>
+          <w:b/>
+          <w:sz w:val="28"/>
+          <w:szCs w:val="28"/>
+        </w:rPr>
+        <w:t>a</w:t>
+      </w:r>
+      <w:r>
+        <w:rPr>
+          <w:rFonts w:ascii="Arial" w:hAnsi="Arial" w:cs="Arial"/>
+          <w:b/>
+          <w:sz w:val="28"/>
+          <w:szCs w:val="28"/>
+        </w:rPr>
+        <w:br/>
+      </w:r>
+      <w:r>
+        <w:rPr>
+          <w:rFonts w:ascii="Arial" w:hAnsi="Arial" w:cs="Arial"/>
+          <w:b/>
+          <w:sz w:val="28"/>
+          <w:szCs w:val="28"/>
+        </w:rPr>
+        <w:t>Felipe Rocha Gomes</w:t>
+      </w:r>
+      <w:r>
+        <w:rPr>
+          <w:rFonts w:ascii="Arial" w:hAnsi="Arial" w:cs="Arial"/>
+          <w:b/>
+          <w:sz w:val="28"/>
+          <w:szCs w:val="28"/>
+        </w:rPr>
+        <w:br/>
+      </w:r>
+      <w:r>
+        <w:rPr>
+          <w:rFonts w:ascii="Arial" w:hAnsi="Arial" w:cs="Arial"/>
+          <w:b/>
+          <w:sz w:val="28"/>
+          <w:szCs w:val="28"/>
+        </w:rPr>
+        <w:t xml:space="preserve">Fernando </w:t>
+      </w:r>
+      <w:proofErr w:type="spellStart"/>
+      <w:r>
+        <w:rPr>
+          <w:rFonts w:ascii="Arial" w:hAnsi="Arial" w:cs="Arial"/>
+          <w:b/>
+          <w:sz w:val="28"/>
+          <w:szCs w:val="28"/>
+        </w:rPr>
+        <w:t>Fiani</w:t>
+      </w:r>
+      <w:proofErr w:type="spellEnd"/>
+      <w:r>
+        <w:rPr>
+          <w:rFonts w:ascii="Arial" w:hAnsi="Arial" w:cs="Arial"/>
+          <w:b/>
+          <w:sz w:val="28"/>
+          <w:szCs w:val="28"/>
+        </w:rPr>
+        <w:t xml:space="preserve"> de Pina Saraiva</w:t>
+      </w:r>
+      <w:r>
+        <w:rPr>
+          <w:rFonts w:ascii="Arial" w:hAnsi="Arial" w:cs="Arial"/>
+          <w:b/>
+          <w:sz w:val="28"/>
+          <w:szCs w:val="28"/>
+        </w:rPr>
+        <w:t xml:space="preserve"> </w:t>
+      </w:r>
+      <w:r>
+        <w:rPr>
+          <w:rFonts w:ascii="Arial" w:hAnsi="Arial" w:cs="Arial"/>
+          <w:b/>
+          <w:sz w:val="28"/>
+          <w:szCs w:val="28"/>
+        </w:rPr>
+        <w:br/>
+      </w:r>
+      <w:r>
+        <w:rPr>
+          <w:rFonts w:ascii="Arial" w:hAnsi="Arial" w:cs="Arial"/>
+          <w:b/>
+          <w:sz w:val="28"/>
+          <w:szCs w:val="28"/>
+        </w:rPr>
+        <w:t>João Vitor Vale de Jesus</w:t>
+      </w:r>
+      <w:r>
+        <w:rPr>
+          <w:rFonts w:ascii="Arial" w:hAnsi="Arial" w:cs="Arial"/>
+          <w:b/>
+          <w:sz w:val="28"/>
+          <w:szCs w:val="28"/>
+        </w:rPr>
+        <w:br/>
+      </w:r>
+      <w:r>
+        <w:rPr>
+          <w:rFonts w:ascii="Arial" w:hAnsi="Arial" w:cs="Arial"/>
+          <w:b/>
+          <w:sz w:val="28"/>
+          <w:szCs w:val="28"/>
+        </w:rPr>
+        <w:t xml:space="preserve">Leonardo </w:t>
+      </w:r>
+      <w:proofErr w:type="spellStart"/>
+      <w:r>
+        <w:rPr>
+          <w:rFonts w:ascii="Arial" w:hAnsi="Arial" w:cs="Arial"/>
+          <w:b/>
+          <w:sz w:val="28"/>
+          <w:szCs w:val="28"/>
+        </w:rPr>
+        <w:t>Buso</w:t>
+      </w:r>
+      <w:proofErr w:type="spellEnd"/>
+      <w:r>
+        <w:rPr>
+          <w:rFonts w:ascii="Arial" w:hAnsi="Arial" w:cs="Arial"/>
+          <w:b/>
+          <w:sz w:val="28"/>
+          <w:szCs w:val="28"/>
+        </w:rPr>
+        <w:t xml:space="preserve"> de Sousa </w:t>
+      </w:r>
+      <w:r>
+        <w:rPr>
+          <w:rFonts w:ascii="Arial" w:hAnsi="Arial" w:cs="Arial"/>
+          <w:b/>
+          <w:sz w:val="28"/>
+          <w:szCs w:val="28"/>
+        </w:rPr>
+        <w:br/>
+      </w:r>
+    </w:p>
+    <w:p>
+      <w:pPr>
+        <w:spacing w:after="0" w:line="360" w:lineRule="auto"/>
+        <w:rPr>
+          <w:rFonts w:ascii="Arial" w:hAnsi="Arial" w:cs="Arial"/>
+          <w:sz w:val="28"/>
+          <w:szCs w:val="28"/>
+        </w:rPr>
+      </w:pPr>
+    </w:p>
+    <w:p>
+      <w:pPr>
+        <w:spacing w:after="0" w:line="360" w:lineRule="auto"/>
+        <w:jc w:val="center"/>
+        <w:rPr>
+          <w:rFonts w:ascii="Arial" w:hAnsi="Arial" w:cs="Arial"/>
+          <w:b/>
+          <w:sz w:val="28"/>
+          <w:szCs w:val="28"/>
+        </w:rPr>
+      </w:pPr>
+    </w:p>
+    <w:p>
+      <w:pPr>
+        <w:spacing w:after="0" w:line="360" w:lineRule="auto"/>
+        <w:jc w:val="center"/>
+        <w:rPr>
+          <w:rFonts w:ascii="Arial" w:hAnsi="Arial" w:cs="Arial"/>
+          <w:b/>
+          <w:sz w:val="28"/>
+          <w:szCs w:val="28"/>
+        </w:rPr>
+      </w:pPr>
+      <w:r>
+        <w:rPr>
+          <w:rStyle w:val="Refdecomentrio"/>
+        </w:rPr>
+        <w:commentReference w:id="0"/>
+      </w:r>
+    </w:p>
+    <w:p>
+      <w:pPr>
+        <w:spacing w:after="0" w:line="360" w:lineRule="auto"/>
+        <w:jc w:val="center"/>
+        <w:rPr>
+          <w:rFonts w:ascii="Arial" w:hAnsi="Arial" w:cs="Arial"/>
+          <w:b/>
+          <w:sz w:val="28"/>
+          <w:szCs w:val="28"/>
+        </w:rPr>
+      </w:pPr>
+    </w:p>
+    <w:p>
+      <w:pPr>
+        <w:spacing w:after="0" w:line="360" w:lineRule="auto"/>
+        <w:jc w:val="center"/>
+        <w:rPr>
+          <w:rFonts w:ascii="Arial" w:hAnsi="Arial" w:cs="Arial"/>
+          <w:b/>
+          <w:sz w:val="28"/>
+          <w:szCs w:val="28"/>
+        </w:rPr>
+      </w:pPr>
+      <w:r>
+        <w:rPr>
+          <w:rFonts w:ascii="Arial" w:hAnsi="Arial" w:cs="Arial"/>
+          <w:b/>
+          <w:sz w:val="28"/>
+          <w:szCs w:val="28"/>
+        </w:rPr>
+        <w:t>NEUROLEARN</w:t>
+      </w:r>
+      <w:r>
+        <w:rPr>
+          <w:rFonts w:ascii="Arial" w:hAnsi="Arial" w:cs="Arial"/>
+          <w:b/>
+          <w:sz w:val="28"/>
+          <w:szCs w:val="28"/>
+        </w:rPr>
+        <w:t>:</w:t>
+      </w:r>
+      <w:r>
+        <w:rPr>
+          <w:rFonts w:ascii="Arial" w:hAnsi="Arial" w:cs="Arial"/>
+          <w:b/>
+          <w:sz w:val="28"/>
+          <w:szCs w:val="28"/>
+        </w:rPr>
+        <w:t xml:space="preserve"> PLATAFORMA DE ADAPTAÇÃO DIDÁTICA COM IA PARA ALUNOS COM TEA</w:t>
+      </w:r>
+    </w:p>
+    <w:p>
+      <w:pPr>
+        <w:spacing w:after="0" w:line="360" w:lineRule="auto"/>
+        <w:jc w:val="center"/>
+        <w:rPr>
+          <w:rFonts w:ascii="Arial" w:hAnsi="Arial" w:cs="Arial"/>
+          <w:sz w:val="28"/>
+          <w:szCs w:val="28"/>
+        </w:rPr>
+      </w:pPr>
+    </w:p>
+    <w:p>
+      <w:pPr>
+        <w:spacing w:after="0" w:line="360" w:lineRule="auto"/>
+        <w:jc w:val="center"/>
+        <w:rPr>
+          <w:rFonts w:ascii="Arial" w:hAnsi="Arial" w:cs="Arial"/>
+          <w:sz w:val="28"/>
+          <w:szCs w:val="28"/>
+        </w:rPr>
+      </w:pPr>
+    </w:p>
+    <w:p>
+      <w:pPr>
+        <w:spacing w:after="0" w:line="360" w:lineRule="auto"/>
+        <w:jc w:val="center"/>
+        <w:rPr>
+          <w:rFonts w:ascii="Arial" w:hAnsi="Arial" w:cs="Arial"/>
+          <w:sz w:val="28"/>
+          <w:szCs w:val="28"/>
+        </w:rPr>
+      </w:pPr>
+    </w:p>
+    <w:p>
+      <w:pPr>
+        <w:spacing w:after="0" w:line="360" w:lineRule="auto"/>
+        <w:jc w:val="center"/>
+        <w:rPr>
+          <w:rFonts w:ascii="Arial" w:hAnsi="Arial" w:cs="Arial"/>
+          <w:sz w:val="28"/>
+          <w:szCs w:val="28"/>
+        </w:rPr>
+      </w:pPr>
+    </w:p>
+    <w:p>
+      <w:pPr>
+        <w:spacing w:after="0" w:line="360" w:lineRule="auto"/>
+        <w:jc w:val="center"/>
+        <w:rPr>
+          <w:rFonts w:ascii="Arial" w:hAnsi="Arial" w:cs="Arial"/>
+          <w:sz w:val="28"/>
+          <w:szCs w:val="28"/>
+        </w:rPr>
+      </w:pPr>
+    </w:p>
+    <w:p>
+      <w:pPr>
+        <w:spacing w:after="0" w:line="360" w:lineRule="auto"/>
+        <w:jc w:val="center"/>
+        <w:rPr>
+          <w:rFonts w:ascii="Arial" w:hAnsi="Arial" w:cs="Arial"/>
+          <w:sz w:val="28"/>
+          <w:szCs w:val="28"/>
+        </w:rPr>
+      </w:pPr>
+      <w:r>
+        <w:rPr>
+          <w:rFonts w:ascii="Arial" w:hAnsi="Arial" w:cs="Arial"/>
+          <w:sz w:val="28"/>
+          <w:szCs w:val="28"/>
+        </w:rPr>
+        <w:t>,</w:t>
+      </w:r>
+    </w:p>
+    <w:p>
+      <w:pPr>
+        <w:spacing w:after="0" w:line="360" w:lineRule="auto"/>
+        <w:rPr>
+          <w:rFonts w:ascii="Arial" w:hAnsi="Arial" w:cs="Arial"/>
+          <w:b/>
+          <w:sz w:val="28"/>
+          <w:szCs w:val="28"/>
+        </w:rPr>
+      </w:pPr>
+    </w:p>
+    <w:p>
+      <w:pPr>
+        <w:spacing w:after="0" w:line="360" w:lineRule="auto"/>
+        <w:jc w:val="center"/>
+        <w:rPr>
+          <w:rFonts w:ascii="Arial" w:hAnsi="Arial" w:cs="Arial"/>
+          <w:b/>
+          <w:sz w:val="28"/>
+          <w:szCs w:val="28"/>
+        </w:rPr>
+      </w:pPr>
+    </w:p>
+    <w:p>
+      <w:pPr>
+        <w:spacing w:after="0" w:line="360" w:lineRule="auto"/>
+        <w:jc w:val="center"/>
+        <w:rPr>
+          <w:rFonts w:ascii="Arial" w:hAnsi="Arial" w:cs="Arial"/>
+          <w:b/>
+          <w:sz w:val="28"/>
+          <w:szCs w:val="28"/>
+        </w:rPr>
+      </w:pPr>
+      <w:r>
+        <w:rPr>
+          <w:rFonts w:ascii="Arial" w:hAnsi="Arial" w:cs="Arial"/>
+          <w:b/>
+          <w:sz w:val="28"/>
+          <w:szCs w:val="28"/>
+        </w:rPr>
+        <w:t>São Paulo</w:t>
+      </w:r>
+    </w:p>
+    <w:p>
+      <w:pPr>
+        <w:spacing w:after="0" w:line="360" w:lineRule="auto"/>
+        <w:jc w:val="center"/>
+        <w:rPr>
+          <w:rFonts w:ascii="Arial" w:hAnsi="Arial" w:cs="Arial"/>
+          <w:b/>
+          <w:sz w:val="28"/>
+          <w:szCs w:val="28"/>
+        </w:rPr>
+      </w:pPr>
+      <w:r>
+        <w:rPr>
+          <w:rFonts w:ascii="Arial" w:hAnsi="Arial" w:cs="Arial"/>
+          <w:b/>
+          <w:sz w:val="28"/>
+          <w:szCs w:val="28"/>
+        </w:rPr>
+        <w:t>2026</w:t>
+      </w:r>
+    </w:p>
+    <w:p>
+      <w:pPr>
+        <w:spacing w:after="0" w:line="360" w:lineRule="auto"/>
+        <w:jc w:val="both"/>
+        <w:rPr>
+          <w:rFonts w:ascii="Arial" w:hAnsi="Arial" w:cs="Arial"/>
+          <w:b/>
+          <w:sz w:val="28"/>
+          <w:szCs w:val="28"/>
+        </w:rPr>
+      </w:pPr>
+      <w:r>
+        <w:rPr>
+          <w:rFonts w:ascii="Arial" w:hAnsi="Arial" w:cs="Arial"/>
+          <w:b/>
+          <w:sz w:val="28"/>
+          <w:szCs w:val="28"/>
+        </w:rPr>
+        <w:lastRenderedPageBreak/>
+        <w:t xml:space="preserve">      </w:t>
+      </w:r>
+      <w:bookmarkStart w:id="1" w:name="_GoBack"/>
+      <w:bookmarkEnd w:id="1"/>
+    </w:p>
+    <w:p>
+      <w:pPr>
+        <w:spacing w:after="0" w:line="360" w:lineRule="auto"/>
+        <w:jc w:val="center"/>
+        <w:rPr>
+          <w:rFonts w:ascii="Arial" w:hAnsi="Arial" w:cs="Arial"/>
+          <w:sz w:val="24"/>
+        </w:rPr>
+      </w:pPr>
+    </w:p>
+    <w:p>
+      <w:pPr>
+        <w:spacing w:after="0" w:line="360" w:lineRule="auto"/>
+        <w:jc w:val="center"/>
+        <w:rPr>
+          <w:rFonts w:ascii="Arial" w:hAnsi="Arial" w:cs="Arial"/>
+          <w:sz w:val="24"/>
+        </w:rPr>
+      </w:pPr>
+    </w:p>
+    <w:p>
+      <w:pPr>
+        <w:spacing w:after="0" w:line="360" w:lineRule="auto"/>
+        <w:jc w:val="center"/>
+        <w:rPr>
+          <w:rFonts w:ascii="Arial" w:hAnsi="Arial" w:cs="Arial"/>
+          <w:sz w:val="24"/>
+        </w:rPr>
+      </w:pPr>
+    </w:p>
+    <w:p>
+      <w:pPr>
+        <w:spacing w:after="0" w:line="360" w:lineRule="auto"/>
+        <w:jc w:val="center"/>
+        <w:rPr>
+          <w:rFonts w:ascii="Arial" w:hAnsi="Arial" w:cs="Arial"/>
+          <w:sz w:val="24"/>
+        </w:rPr>
+      </w:pPr>
+    </w:p>
+    <w:p>
+      <w:pPr>
+        <w:spacing w:after="0" w:line="360" w:lineRule="auto"/>
+        <w:jc w:val="center"/>
+        <w:rPr>
+          <w:rFonts w:ascii="Arial" w:hAnsi="Arial" w:cs="Arial"/>
+          <w:sz w:val="24"/>
+        </w:rPr>
+      </w:pPr>
+    </w:p>
+    <w:p>
+      <w:pPr>
+        <w:spacing w:after="0" w:line="360" w:lineRule="auto"/>
+        <w:jc w:val="center"/>
+        <w:rPr>
+          <w:rFonts w:ascii="Arial" w:hAnsi="Arial" w:cs="Arial"/>
+          <w:sz w:val="24"/>
+        </w:rPr>
+      </w:pPr>
+    </w:p>
+    <w:p>
+      <w:pPr>
+        <w:spacing w:after="0" w:line="360" w:lineRule="auto"/>
+        <w:jc w:val="center"/>
+        <w:rPr>
+          <w:rFonts w:ascii="Arial" w:hAnsi="Arial" w:cs="Arial"/>
+          <w:sz w:val="24"/>
+        </w:rPr>
+      </w:pPr>
+    </w:p>
+    <w:p>
+      <w:pPr>
+        <w:spacing w:after="0" w:line="360" w:lineRule="auto"/>
+        <w:jc w:val="center"/>
+        <w:rPr>
+          <w:rFonts w:ascii="Arial" w:hAnsi="Arial" w:cs="Arial"/>
+          <w:sz w:val="24"/>
+        </w:rPr>
+      </w:pPr>
+    </w:p>
+    <w:p>
+      <w:pPr>
+        <w:spacing w:after="0" w:line="360" w:lineRule="auto"/>
+        <w:jc w:val="center"/>
+        <w:rPr>
+          <w:rFonts w:ascii="Arial" w:hAnsi="Arial" w:cs="Arial"/>
+          <w:sz w:val="24"/>
+        </w:rPr>
+      </w:pPr>
+    </w:p>
+    <w:p>
+      <w:pPr>
+        <w:spacing w:after="0" w:line="360" w:lineRule="auto"/>
+        <w:jc w:val="center"/>
+        <w:rPr>
+          <w:rFonts w:ascii="Arial" w:hAnsi="Arial" w:cs="Arial"/>
+          <w:sz w:val="24"/>
+        </w:rPr>
+      </w:pPr>
+    </w:p>
+    <w:p>
+      <w:pPr>
+        <w:spacing w:after="0" w:line="360" w:lineRule="auto"/>
+        <w:jc w:val="center"/>
+        <w:rPr>
+          <w:rFonts w:ascii="Arial" w:hAnsi="Arial" w:cs="Arial"/>
+          <w:sz w:val="24"/>
+        </w:rPr>
+      </w:pPr>
+    </w:p>
+    <w:p>
+      <w:pPr>
+        <w:spacing w:after="0" w:line="360" w:lineRule="auto"/>
+        <w:jc w:val="center"/>
+        <w:rPr>
+          <w:rFonts w:ascii="Arial" w:hAnsi="Arial" w:cs="Arial"/>
+          <w:sz w:val="24"/>
+        </w:rPr>
+      </w:pPr>
+    </w:p>
+    <w:p>
+      <w:pPr>
+        <w:spacing w:after="0" w:line="360" w:lineRule="auto"/>
+        <w:jc w:val="center"/>
+        <w:rPr>
+          <w:rFonts w:ascii="Arial" w:hAnsi="Arial" w:cs="Arial"/>
+          <w:sz w:val="24"/>
+        </w:rPr>
+      </w:pPr>
+    </w:p>
+    <w:p>
+      <w:pPr>
+        <w:spacing w:after="0" w:line="360" w:lineRule="auto"/>
+        <w:jc w:val="center"/>
+        <w:rPr>
+          <w:rFonts w:ascii="Arial" w:hAnsi="Arial" w:cs="Arial"/>
+          <w:sz w:val="24"/>
+        </w:rPr>
+      </w:pPr>
+    </w:p>
+    <w:p>
+      <w:pPr>
+        <w:spacing w:after="0" w:line="360" w:lineRule="auto"/>
+        <w:jc w:val="center"/>
+        <w:rPr>
+          <w:rFonts w:ascii="Arial" w:hAnsi="Arial" w:cs="Arial"/>
+          <w:sz w:val="24"/>
+        </w:rPr>
+      </w:pPr>
+    </w:p>
+    <w:p>
+      <w:pPr>
+        <w:spacing w:after="0" w:line="360" w:lineRule="auto"/>
+        <w:jc w:val="center"/>
+        <w:rPr>
+          <w:rFonts w:ascii="Arial" w:hAnsi="Arial" w:cs="Arial"/>
+          <w:sz w:val="24"/>
+        </w:rPr>
+      </w:pPr>
+    </w:p>
+    <w:p>
+      <w:pPr>
+        <w:spacing w:after="0" w:line="360" w:lineRule="auto"/>
+        <w:jc w:val="center"/>
+        <w:rPr>
+          <w:rFonts w:ascii="Arial" w:hAnsi="Arial" w:cs="Arial"/>
+          <w:sz w:val="24"/>
+        </w:rPr>
+      </w:pPr>
+    </w:p>
+    <w:p>
+      <w:pPr>
+        <w:spacing w:after="0" w:line="360" w:lineRule="auto"/>
+        <w:jc w:val="center"/>
+        <w:rPr>
+          <w:rFonts w:ascii="Arial" w:hAnsi="Arial" w:cs="Arial"/>
+          <w:sz w:val="24"/>
+        </w:rPr>
+      </w:pPr>
+    </w:p>
+    <w:p>
+      <w:pPr>
+        <w:spacing w:after="0" w:line="360" w:lineRule="auto"/>
+        <w:jc w:val="center"/>
+        <w:rPr>
+          <w:rFonts w:ascii="Arial" w:hAnsi="Arial" w:cs="Arial"/>
+          <w:sz w:val="24"/>
+        </w:rPr>
+      </w:pPr>
+    </w:p>
+    <w:p>
+      <w:pPr>
+        <w:spacing w:after="0" w:line="360" w:lineRule="auto"/>
+        <w:jc w:val="center"/>
+        <w:rPr>
+          <w:rFonts w:ascii="Arial" w:hAnsi="Arial" w:cs="Arial"/>
+          <w:sz w:val="24"/>
+        </w:rPr>
+      </w:pPr>
+    </w:p>
+    <w:p>
+      <w:pPr>
+        <w:spacing w:after="0" w:line="360" w:lineRule="auto"/>
+        <w:jc w:val="center"/>
+        <w:rPr>
+          <w:rFonts w:ascii="Arial" w:hAnsi="Arial" w:cs="Arial"/>
+          <w:sz w:val="24"/>
+        </w:rPr>
+      </w:pPr>
+    </w:p>
+    <w:p>
+      <w:pPr>
+        <w:spacing w:after="0" w:line="360" w:lineRule="auto"/>
+        <w:jc w:val="center"/>
+        <w:rPr>
+          <w:rFonts w:ascii="Arial" w:hAnsi="Arial" w:cs="Arial"/>
+          <w:sz w:val="24"/>
+        </w:rPr>
+      </w:pPr>
+    </w:p>
+    <w:p>
+      <w:pPr>
+        <w:spacing w:after="0" w:line="360" w:lineRule="auto"/>
+        <w:jc w:val="center"/>
+        <w:rPr>
+          <w:rFonts w:ascii="Arial" w:hAnsi="Arial" w:cs="Arial"/>
+          <w:sz w:val="24"/>
+        </w:rPr>
+      </w:pPr>
+    </w:p>
+    <w:p>
+      <w:pPr>
+        <w:spacing w:after="0" w:line="360" w:lineRule="auto"/>
+        <w:jc w:val="center"/>
+        <w:rPr>
+          <w:rFonts w:ascii="Arial" w:hAnsi="Arial" w:cs="Arial"/>
+          <w:sz w:val="24"/>
+        </w:rPr>
+      </w:pPr>
+    </w:p>
+    <w:p>
+      <w:pPr>
+        <w:spacing w:after="0" w:line="360" w:lineRule="auto"/>
+        <w:jc w:val="center"/>
+        <w:rPr>
+          <w:rFonts w:ascii="Arial" w:hAnsi="Arial" w:cs="Arial"/>
+          <w:sz w:val="24"/>
+        </w:rPr>
+      </w:pPr>
+    </w:p>
+    <w:p>
+      <w:pPr>
+        <w:spacing w:after="0" w:line="360" w:lineRule="auto"/>
+        <w:jc w:val="center"/>
+        <w:rPr>
+          <w:rFonts w:ascii="Arial" w:hAnsi="Arial" w:cs="Arial"/>
+          <w:sz w:val="24"/>
+        </w:rPr>
+      </w:pPr>
+    </w:p>
+    <w:p>
+      <w:pPr>
+        <w:spacing w:after="0" w:line="360" w:lineRule="auto"/>
+        <w:jc w:val="center"/>
+        <w:rPr>
+          <w:rFonts w:ascii="Arial" w:hAnsi="Arial" w:cs="Arial"/>
+          <w:sz w:val="24"/>
+        </w:rPr>
+      </w:pPr>
+    </w:p>
+    <w:p>
+      <w:pPr>
+        <w:spacing w:after="0" w:line="360" w:lineRule="auto"/>
+        <w:jc w:val="center"/>
+        <w:rPr>
+          <w:rFonts w:ascii="Arial" w:hAnsi="Arial" w:cs="Arial"/>
+          <w:sz w:val="24"/>
+        </w:rPr>
+      </w:pPr>
+    </w:p>
+    <w:p>
+      <w:pPr>
+        <w:spacing w:after="0" w:line="360" w:lineRule="auto"/>
+        <w:jc w:val="center"/>
+        <w:rPr>
+          <w:rFonts w:ascii="Arial" w:hAnsi="Arial" w:cs="Arial"/>
+          <w:sz w:val="24"/>
+        </w:rPr>
+      </w:pPr>
+    </w:p>
+    <w:p>
+      <w:pPr>
+        <w:spacing w:after="0" w:line="360" w:lineRule="auto"/>
+        <w:jc w:val="center"/>
+        <w:rPr>
+          <w:rFonts w:ascii="Arial" w:hAnsi="Arial" w:cs="Arial"/>
+          <w:sz w:val="24"/>
+        </w:rPr>
+      </w:pPr>
+    </w:p>
+    <w:p>
+      <w:pPr>
+        <w:spacing w:after="0" w:line="360" w:lineRule="auto"/>
+        <w:jc w:val="center"/>
+        <w:rPr>
+          <w:rFonts w:ascii="Arial" w:hAnsi="Arial" w:cs="Arial"/>
+          <w:sz w:val="24"/>
+        </w:rPr>
+      </w:pPr>
+    </w:p>
+    <w:p>
+      <w:pPr>
+        <w:spacing w:after="0" w:line="360" w:lineRule="auto"/>
+        <w:jc w:val="center"/>
+        <w:rPr>
+          <w:rFonts w:ascii="Arial" w:hAnsi="Arial" w:cs="Arial"/>
+          <w:sz w:val="24"/>
+        </w:rPr>
+      </w:pPr>
+    </w:p>
+    <w:p>
+      <w:pPr>
+        <w:spacing w:after="0" w:line="360" w:lineRule="auto"/>
+        <w:jc w:val="center"/>
+        <w:rPr>
+          <w:rFonts w:ascii="Arial" w:hAnsi="Arial" w:cs="Arial"/>
+          <w:sz w:val="24"/>
+        </w:rPr>
+      </w:pPr>
+      <w:r>
+        <w:rPr>
+          <w:rFonts w:ascii="Arial" w:hAnsi="Arial" w:cs="Arial"/>
+          <w:sz w:val="24"/>
+        </w:rPr>
+        <w:lastRenderedPageBreak/>
         <w:t>TEA LEARN</w:t>
       </w:r>
     </w:p>
@@ -184,38 +1112,14 @@
           <w:sz w:val="24"/>
         </w:rPr>
       </w:pPr>
-      <w:hyperlink r:id="rId5" w:history="1">
+      <w:hyperlink r:id="rId8" w:history="1">
         <w:r>
           <w:rPr>
             <w:rStyle w:val="Hyperlink"/>
             <w:rFonts w:ascii="Arial" w:hAnsi="Arial" w:cs="Arial"/>
             <w:sz w:val="24"/>
           </w:rPr>
-          <w:t>https://repositorio.ifes.edu.b</w:t>
-        </w:r>
-        <w:r>
-          <w:rPr>
-            <w:rStyle w:val="Hyperlink"/>
-            <w:rFonts w:ascii="Arial" w:hAnsi="Arial" w:cs="Arial"/>
-            <w:sz w:val="24"/>
-          </w:rPr>
-          <w:t>r</w:t>
-        </w:r>
-        <w:r>
-          <w:rPr>
-            <w:rStyle w:val="Hyperlink"/>
-            <w:rFonts w:ascii="Arial" w:hAnsi="Arial" w:cs="Arial"/>
-            <w:sz w:val="24"/>
-          </w:rPr>
-          <w:t>/server/api/core/bitstreams/17459002-</w:t>
-        </w:r>
-        <w:r>
-          <w:rPr>
-            <w:rStyle w:val="Hyperlink"/>
-            <w:rFonts w:ascii="Arial" w:hAnsi="Arial" w:cs="Arial"/>
-            <w:sz w:val="24"/>
-          </w:rPr>
-          <w:t>d123-4b2d-aebd-23e19491cef3/content</w:t>
+          <w:t>https://repositorio.ifes.edu.br/server/api/core/bitstreams/17459002-d123-4b2d-aebd-23e19491cef3/content</w:t>
         </w:r>
       </w:hyperlink>
     </w:p>
@@ -246,7 +1150,7 @@
           <w:sz w:val="24"/>
         </w:rPr>
       </w:pPr>
-      <w:hyperlink r:id="rId6" w:history="1">
+      <w:hyperlink r:id="rId9" w:history="1">
         <w:r>
           <w:rPr>
             <w:rStyle w:val="Hyperlink"/>
@@ -291,7 +1195,7 @@
           <w:sz w:val="24"/>
         </w:rPr>
       </w:pPr>
-      <w:hyperlink r:id="rId7" w:history="1">
+      <w:hyperlink r:id="rId10" w:history="1">
         <w:r>
           <w:rPr>
             <w:rStyle w:val="Hyperlink"/>
@@ -343,7 +1247,7 @@
           <w:sz w:val="24"/>
         </w:rPr>
       </w:pPr>
-      <w:hyperlink r:id="rId8" w:history="1">
+      <w:hyperlink r:id="rId11" w:history="1">
         <w:r>
           <w:rPr>
             <w:rStyle w:val="Hyperlink"/>
@@ -395,7 +1299,7 @@
           <w:sz w:val="24"/>
         </w:rPr>
       </w:pPr>
-      <w:hyperlink r:id="rId9" w:history="1">
+      <w:hyperlink r:id="rId12" w:history="1">
         <w:r>
           <w:rPr>
             <w:rStyle w:val="Hyperlink"/>
@@ -440,7 +1344,7 @@
           <w:sz w:val="24"/>
         </w:rPr>
       </w:pPr>
-      <w:hyperlink r:id="rId10" w:history="1">
+      <w:hyperlink r:id="rId13" w:history="1">
         <w:r>
           <w:rPr>
             <w:rStyle w:val="Hyperlink"/>
@@ -470,7 +1374,7 @@
           <w:sz w:val="24"/>
         </w:rPr>
       </w:pPr>
-      <w:hyperlink r:id="rId11" w:history="1">
+      <w:hyperlink r:id="rId14" w:history="1">
         <w:r>
           <w:rPr>
             <w:rStyle w:val="Hyperlink"/>
@@ -515,7 +1419,7 @@
           <w:sz w:val="24"/>
         </w:rPr>
       </w:pPr>
-      <w:hyperlink r:id="rId12" w:history="1">
+      <w:hyperlink r:id="rId15" w:history="1">
         <w:r>
           <w:rPr>
             <w:rStyle w:val="Hyperlink"/>
@@ -545,7 +1449,7 @@
           <w:sz w:val="24"/>
         </w:rPr>
       </w:pPr>
-      <w:hyperlink r:id="rId13" w:history="1">
+      <w:hyperlink r:id="rId16" w:history="1">
         <w:r>
           <w:rPr>
             <w:rStyle w:val="Hyperlink"/>
@@ -575,7 +1479,6 @@
           <w:rFonts w:ascii="Arial" w:hAnsi="Arial" w:cs="Arial"/>
           <w:sz w:val="24"/>
         </w:rPr>
-        <w:lastRenderedPageBreak/>
         <w:t>DI:</w:t>
       </w:r>
     </w:p>
@@ -591,7 +1494,7 @@
           <w:sz w:val="24"/>
         </w:rPr>
       </w:pPr>
-      <w:hyperlink r:id="rId14" w:history="1">
+      <w:hyperlink r:id="rId17" w:history="1">
         <w:r>
           <w:rPr>
             <w:rStyle w:val="Hyperlink"/>
@@ -794,8 +1697,6 @@
         </w:rPr>
         <w:t>baixa estruturação visual</w:t>
       </w:r>
-      <w:bookmarkStart w:id="0" w:name="_GoBack"/>
-      <w:bookmarkEnd w:id="0"/>
     </w:p>
     <w:p>
       <w:pPr>
@@ -1009,8 +1910,8 @@
       </w:r>
     </w:p>
     <w:sectPr>
-      <w:pgSz w:w="11906" w:h="16838"/>
-      <w:pgMar w:top="1417" w:right="1701" w:bottom="1417" w:left="1701" w:header="708" w:footer="708" w:gutter="0"/>
+      <w:pgSz w:w="11906" w:h="16838" w:code="9"/>
+      <w:pgMar w:top="1701" w:right="1134" w:bottom="1134" w:left="1701" w:header="1134" w:footer="1134" w:gutter="0"/>
       <w:cols w:space="708"/>
       <w:docGrid w:linePitch="360"/>
     </w:sectPr>
@@ -1018,8 +1919,46 @@
 </w:document>
 </file>
 
+<file path=word/comments.xml><?xml version="1.0" encoding="utf-8"?>
+<w:comments xmlns:wpc="http://schemas.microsoft.com/office/word/2010/wordprocessingCanvas" xmlns:cx="http://schemas.microsoft.com/office/drawing/2014/chartex" xmlns:cx1="http://schemas.microsoft.com/office/drawing/2015/9/8/chartex" xmlns:cx2="http://schemas.microsoft.com/office/drawing/2015/10/21/chartex" xmlns:cx3="http://schemas.microsoft.com/office/drawing/2016/5/9/chartex" xmlns:cx4="http://schemas.microsoft.com/office/drawing/2016/5/10/chartex" xmlns:cx5="http://schemas.microsoft.com/office/drawing/2016/5/11/chartex" xmlns:cx6="http://schemas.microsoft.com/office/drawing/2016/5/12/chartex" xmlns:cx7="http://schemas.microsoft.com/office/drawing/2016/5/13/chartex" xmlns:cx8="http://schemas.microsoft.com/office/drawing/2016/5/14/chartex" xmlns:mc="http://schemas.openxmlformats.org/markup-compatibility/2006" xmlns:aink="http://schemas.microsoft.com/office/drawing/2016/ink" xmlns:am3d="http://schemas.microsoft.com/office/drawing/2017/model3d" xmlns:o="urn:schemas-microsoft-com:office:office" xmlns:r="http://schemas.openxmlformats.org/officeDocument/2006/relationships" xmlns:m="http://schemas.openxmlformats.org/officeDocument/2006/math" xmlns:v="urn:schemas-microsoft-com:vml" xmlns:wp14="http://schemas.microsoft.com/office/word/2010/wordprocessingDrawing" xmlns:wp="http://schemas.openxmlformats.org/drawingml/2006/wordprocessingDrawing" xmlns:w10="urn:schemas-microsoft-com:office:word" xmlns:w="http://schemas.openxmlformats.org/wordprocessingml/2006/main" xmlns:w14="http://schemas.microsoft.com/office/word/2010/wordml" xmlns:w15="http://schemas.microsoft.com/office/word/2012/wordml" xmlns:w16cid="http://schemas.microsoft.com/office/word/2016/wordml/cid" xmlns:w16se="http://schemas.microsoft.com/office/word/2015/wordml/symex" xmlns:wpg="http://schemas.microsoft.com/office/word/2010/wordprocessingGroup" xmlns:wpi="http://schemas.microsoft.com/office/word/2010/wordprocessingInk" xmlns:wne="http://schemas.microsoft.com/office/word/2006/wordml" xmlns:wps="http://schemas.microsoft.com/office/word/2010/wordprocessingShape" mc:Ignorable="w14 w15 w16se w16cid wp14">
+  <w:comment w:id="0" w:author="CAMARGO" w:date="2026-05-07T09:03:00Z" w:initials="C">
+    <w:p>
+      <w:pPr>
+        <w:pStyle w:val="Textodecomentrio"/>
+      </w:pPr>
+      <w:r>
+        <w:rPr>
+          <w:rStyle w:val="Refdecomentrio"/>
+        </w:rPr>
+        <w:annotationRef/>
+      </w:r>
+      <w:r>
+        <w:t xml:space="preserve">Estou usando o manual do </w:t>
+      </w:r>
+      <w:proofErr w:type="spellStart"/>
+      <w:r>
+        <w:t>tcc</w:t>
+      </w:r>
+      <w:proofErr w:type="spellEnd"/>
+      <w:r>
+        <w:t xml:space="preserve"> padrão do centro Paula Souza de 2022 </w:t>
+      </w:r>
+      <w:r>
+        <w:t>https://etecparquedajuventude.cps.sp.gov.br/doc-tcc/</w:t>
+      </w:r>
+    </w:p>
+  </w:comment>
+</w:comments>
+</file>
+
+<file path=word/commentsExtended.xml><?xml version="1.0" encoding="utf-8"?>
+<w15:commentsEx xmlns:wpc="http://schemas.microsoft.com/office/word/2010/wordprocessingCanvas" xmlns:cx="http://schemas.microsoft.com/office/drawing/2014/chartex" xmlns:cx1="http://schemas.microsoft.com/office/drawing/2015/9/8/chartex" xmlns:cx2="http://schemas.microsoft.com/office/drawing/2015/10/21/chartex" xmlns:cx3="http://schemas.microsoft.com/office/drawing/2016/5/9/chartex" xmlns:cx4="http://schemas.microsoft.com/office/drawing/2016/5/10/chartex" xmlns:cx5="http://schemas.microsoft.com/office/drawing/2016/5/11/chartex" xmlns:cx6="http://schemas.microsoft.com/office/drawing/2016/5/12/chartex" xmlns:cx7="http://schemas.microsoft.com/office/drawing/2016/5/13/chartex" xmlns:cx8="http://schemas.microsoft.com/office/drawing/2016/5/14/chartex" xmlns:mc="http://schemas.openxmlformats.org/markup-compatibility/2006" xmlns:aink="http://schemas.microsoft.com/office/drawing/2016/ink" xmlns:am3d="http://schemas.microsoft.com/office/drawing/2017/model3d" xmlns:o="urn:schemas-microsoft-com:office:office" xmlns:r="http://schemas.openxmlformats.org/officeDocument/2006/relationships" xmlns:m="http://schemas.openxmlformats.org/officeDocument/2006/math" xmlns:v="urn:schemas-microsoft-com:vml" xmlns:wp14="http://schemas.microsoft.com/office/word/2010/wordprocessingDrawing" xmlns:wp="http://schemas.openxmlformats.org/drawingml/2006/wordprocessingDrawing" xmlns:w10="urn:schemas-microsoft-com:office:word" xmlns:w="http://schemas.openxmlformats.org/wordprocessingml/2006/main" xmlns:w14="http://schemas.microsoft.com/office/word/2010/wordml" xmlns:w15="http://schemas.microsoft.com/office/word/2012/wordml" xmlns:w16cid="http://schemas.microsoft.com/office/word/2016/wordml/cid" xmlns:w16se="http://schemas.microsoft.com/office/word/2015/wordml/symex" xmlns:wpg="http://schemas.microsoft.com/office/word/2010/wordprocessingGroup" xmlns:wpi="http://schemas.microsoft.com/office/word/2010/wordprocessingInk" xmlns:wne="http://schemas.microsoft.com/office/word/2006/wordml" xmlns:wps="http://schemas.microsoft.com/office/word/2010/wordprocessingShape" mc:Ignorable="w14 w15 w16se w16cid wp14">
+  <w15:commentEx w15:paraId="6A553135" w15:done="0"/>
+</w15:commentsEx>
+</file>
+
 <file path=word/numbering.xml><?xml version="1.0" encoding="utf-8"?>
-<w:numbering xmlns:wpc="http://schemas.microsoft.com/office/word/2010/wordprocessingCanvas" xmlns:cx="http://schemas.microsoft.com/office/drawing/2014/chartex" xmlns:mc="http://schemas.openxmlformats.org/markup-compatibility/2006" xmlns:o="urn:schemas-microsoft-com:office:office" xmlns:r="http://schemas.openxmlformats.org/officeDocument/2006/relationships" xmlns:m="http://schemas.openxmlformats.org/officeDocument/2006/math" xmlns:v="urn:schemas-microsoft-com:vml" xmlns:wp14="http://schemas.microsoft.com/office/word/2010/wordprocessingDrawing" xmlns:wp="http://schemas.openxmlformats.org/drawingml/2006/wordprocessingDrawing" xmlns:w10="urn:schemas-microsoft-com:office:word" xmlns:w="http://schemas.openxmlformats.org/wordprocessingml/2006/main" xmlns:w14="http://schemas.microsoft.com/office/word/2010/wordml" xmlns:w15="http://schemas.microsoft.com/office/word/2012/wordml" xmlns:w16se="http://schemas.microsoft.com/office/word/2015/wordml/symex" xmlns:wpg="http://schemas.microsoft.com/office/word/2010/wordprocessingGroup" xmlns:wpi="http://schemas.microsoft.com/office/word/2010/wordprocessingInk" xmlns:wne="http://schemas.microsoft.com/office/word/2006/wordml" xmlns:wps="http://schemas.microsoft.com/office/word/2010/wordprocessingShape" mc:Ignorable="w14 w15 w16se wp14">
+<w:numbering xmlns:wpc="http://schemas.microsoft.com/office/word/2010/wordprocessingCanvas" xmlns:cx="http://schemas.microsoft.com/office/drawing/2014/chartex" xmlns:cx1="http://schemas.microsoft.com/office/drawing/2015/9/8/chartex" xmlns:cx2="http://schemas.microsoft.com/office/drawing/2015/10/21/chartex" xmlns:cx3="http://schemas.microsoft.com/office/drawing/2016/5/9/chartex" xmlns:cx4="http://schemas.microsoft.com/office/drawing/2016/5/10/chartex" xmlns:cx5="http://schemas.microsoft.com/office/drawing/2016/5/11/chartex" xmlns:cx6="http://schemas.microsoft.com/office/drawing/2016/5/12/chartex" xmlns:cx7="http://schemas.microsoft.com/office/drawing/2016/5/13/chartex" xmlns:cx8="http://schemas.microsoft.com/office/drawing/2016/5/14/chartex" xmlns:mc="http://schemas.openxmlformats.org/markup-compatibility/2006" xmlns:aink="http://schemas.microsoft.com/office/drawing/2016/ink" xmlns:am3d="http://schemas.microsoft.com/office/drawing/2017/model3d" xmlns:o="urn:schemas-microsoft-com:office:office" xmlns:r="http://schemas.openxmlformats.org/officeDocument/2006/relationships" xmlns:m="http://schemas.openxmlformats.org/officeDocument/2006/math" xmlns:v="urn:schemas-microsoft-com:vml" xmlns:wp14="http://schemas.microsoft.com/office/word/2010/wordprocessingDrawing" xmlns:wp="http://schemas.openxmlformats.org/drawingml/2006/wordprocessingDrawing" xmlns:w10="urn:schemas-microsoft-com:office:word" xmlns:w="http://schemas.openxmlformats.org/wordprocessingml/2006/main" xmlns:w14="http://schemas.microsoft.com/office/word/2010/wordml" xmlns:w15="http://schemas.microsoft.com/office/word/2012/wordml" xmlns:w16cid="http://schemas.microsoft.com/office/word/2016/wordml/cid" xmlns:w16se="http://schemas.microsoft.com/office/word/2015/wordml/symex" xmlns:wpg="http://schemas.microsoft.com/office/word/2010/wordprocessingGroup" xmlns:wpi="http://schemas.microsoft.com/office/word/2010/wordprocessingInk" xmlns:wne="http://schemas.microsoft.com/office/word/2006/wordml" xmlns:wps="http://schemas.microsoft.com/office/word/2010/wordprocessingShape" mc:Ignorable="w14 w15 w16se w16cid wp14">
   <w:abstractNum w:abstractNumId="0" w15:restartNumberingAfterBreak="0">
     <w:nsid w:val="089D108D"/>
     <w:multiLevelType w:val="hybridMultilevel"/>
@@ -2620,8 +3559,16 @@
 </w:numbering>
 </file>
 
+<file path=word/people.xml><?xml version="1.0" encoding="utf-8"?>
+<w15:people xmlns:wpc="http://schemas.microsoft.com/office/word/2010/wordprocessingCanvas" xmlns:cx="http://schemas.microsoft.com/office/drawing/2014/chartex" xmlns:cx1="http://schemas.microsoft.com/office/drawing/2015/9/8/chartex" xmlns:cx2="http://schemas.microsoft.com/office/drawing/2015/10/21/chartex" xmlns:cx3="http://schemas.microsoft.com/office/drawing/2016/5/9/chartex" xmlns:cx4="http://schemas.microsoft.com/office/drawing/2016/5/10/chartex" xmlns:cx5="http://schemas.microsoft.com/office/drawing/2016/5/11/chartex" xmlns:cx6="http://schemas.microsoft.com/office/drawing/2016/5/12/chartex" xmlns:cx7="http://schemas.microsoft.com/office/drawing/2016/5/13/chartex" xmlns:cx8="http://schemas.microsoft.com/office/drawing/2016/5/14/chartex" xmlns:mc="http://schemas.openxmlformats.org/markup-compatibility/2006" xmlns:aink="http://schemas.microsoft.com/office/drawing/2016/ink" xmlns:am3d="http://schemas.microsoft.com/office/drawing/2017/model3d" xmlns:o="urn:schemas-microsoft-com:office:office" xmlns:r="http://schemas.openxmlformats.org/officeDocument/2006/relationships" xmlns:m="http://schemas.openxmlformats.org/officeDocument/2006/math" xmlns:v="urn:schemas-microsoft-com:vml" xmlns:wp14="http://schemas.microsoft.com/office/word/2010/wordprocessingDrawing" xmlns:wp="http://schemas.openxmlformats.org/drawingml/2006/wordprocessingDrawing" xmlns:w10="urn:schemas-microsoft-com:office:word" xmlns:w="http://schemas.openxmlformats.org/wordprocessingml/2006/main" xmlns:w14="http://schemas.microsoft.com/office/word/2010/wordml" xmlns:w15="http://schemas.microsoft.com/office/word/2012/wordml" xmlns:w16cid="http://schemas.microsoft.com/office/word/2016/wordml/cid" xmlns:w16se="http://schemas.microsoft.com/office/word/2015/wordml/symex" xmlns:wpg="http://schemas.microsoft.com/office/word/2010/wordprocessingGroup" xmlns:wpi="http://schemas.microsoft.com/office/word/2010/wordprocessingInk" xmlns:wne="http://schemas.microsoft.com/office/word/2006/wordml" xmlns:wps="http://schemas.microsoft.com/office/word/2010/wordprocessingShape" mc:Ignorable="w14 w15 w16se w16cid wp14">
+  <w15:person w15:author="CAMARGO">
+    <w15:presenceInfo w15:providerId="None" w15:userId="CAMARGO"/>
+  </w15:person>
+</w15:people>
+</file>
+
 <file path=word/styles.xml><?xml version="1.0" encoding="utf-8"?>
-<w:styles xmlns:mc="http://schemas.openxmlformats.org/markup-compatibility/2006" xmlns:r="http://schemas.openxmlformats.org/officeDocument/2006/relationships" xmlns:w="http://schemas.openxmlformats.org/wordprocessingml/2006/main" xmlns:w14="http://schemas.microsoft.com/office/word/2010/wordml" xmlns:w15="http://schemas.microsoft.com/office/word/2012/wordml" xmlns:w16se="http://schemas.microsoft.com/office/word/2015/wordml/symex" mc:Ignorable="w14 w15 w16se">
+<w:styles xmlns:mc="http://schemas.openxmlformats.org/markup-compatibility/2006" xmlns:r="http://schemas.openxmlformats.org/officeDocument/2006/relationships" xmlns:w="http://schemas.openxmlformats.org/wordprocessingml/2006/main" xmlns:w14="http://schemas.microsoft.com/office/word/2010/wordml" xmlns:w15="http://schemas.microsoft.com/office/word/2012/wordml" xmlns:w16cid="http://schemas.microsoft.com/office/word/2016/wordml/cid" xmlns:w16se="http://schemas.microsoft.com/office/word/2015/wordml/symex" mc:Ignorable="w14 w15 w16se w16cid">
   <w:docDefaults>
     <w:rPrDefault>
       <w:rPr>
@@ -2637,7 +3584,7 @@
       </w:pPr>
     </w:pPrDefault>
   </w:docDefaults>
-  <w:latentStyles w:defLockedState="0" w:defUIPriority="99" w:defSemiHidden="0" w:defUnhideWhenUsed="0" w:defQFormat="0" w:count="371">
+  <w:latentStyles w:defLockedState="0" w:defUIPriority="99" w:defSemiHidden="0" w:defUnhideWhenUsed="0" w:defQFormat="0" w:count="375">
     <w:lsdException w:name="Normal" w:uiPriority="0" w:qFormat="1"/>
     <w:lsdException w:name="heading 1" w:uiPriority="9" w:qFormat="1"/>
     <w:lsdException w:name="heading 2" w:semiHidden="1" w:uiPriority="9" w:unhideWhenUsed="1" w:qFormat="1"/>
@@ -2743,7 +3690,6 @@
     <w:lsdException w:name="HTML Sample" w:semiHidden="1" w:unhideWhenUsed="1"/>
     <w:lsdException w:name="HTML Typewriter" w:semiHidden="1" w:unhideWhenUsed="1"/>
     <w:lsdException w:name="HTML Variable" w:semiHidden="1" w:unhideWhenUsed="1"/>
-    <w:lsdException w:name="Normal Table" w:semiHidden="1" w:unhideWhenUsed="1"/>
     <w:lsdException w:name="annotation subject" w:semiHidden="1" w:unhideWhenUsed="1"/>
     <w:lsdException w:name="No List" w:semiHidden="1" w:unhideWhenUsed="1"/>
     <w:lsdException w:name="Outline List 1" w:semiHidden="1" w:unhideWhenUsed="1"/>
@@ -2787,10 +3733,8 @@
     <w:lsdException w:name="Table Elegant" w:semiHidden="1" w:unhideWhenUsed="1"/>
     <w:lsdException w:name="Table Professional" w:semiHidden="1" w:unhideWhenUsed="1"/>
     <w:lsdException w:name="Table Subtle 1" w:semiHidden="1" w:unhideWhenUsed="1"/>
-    <w:lsdException w:name="Table Subtle 2" w:semiHidden="1" w:unhideWhenUsed="1"/>
     <w:lsdException w:name="Table Web 1" w:semiHidden="1" w:unhideWhenUsed="1"/>
     <w:lsdException w:name="Table Web 2" w:semiHidden="1" w:unhideWhenUsed="1"/>
-    <w:lsdException w:name="Table Web 3" w:semiHidden="1" w:unhideWhenUsed="1"/>
     <w:lsdException w:name="Balloon Text" w:semiHidden="1" w:unhideWhenUsed="1"/>
     <w:lsdException w:name="Table Grid" w:uiPriority="39"/>
     <w:lsdException w:name="Table Theme" w:semiHidden="1" w:unhideWhenUsed="1"/>
@@ -3009,15 +3953,39 @@
     <w:lsdException w:name="List Table 5 Dark Accent 6" w:uiPriority="50"/>
     <w:lsdException w:name="List Table 6 Colorful Accent 6" w:uiPriority="51"/>
     <w:lsdException w:name="List Table 7 Colorful Accent 6" w:uiPriority="52"/>
+    <w:lsdException w:name="Mention" w:semiHidden="1" w:unhideWhenUsed="1"/>
+    <w:lsdException w:name="Smart Hyperlink" w:semiHidden="1" w:unhideWhenUsed="1"/>
+    <w:lsdException w:name="Hashtag" w:semiHidden="1" w:unhideWhenUsed="1"/>
+    <w:lsdException w:name="Unresolved Mention" w:semiHidden="1" w:unhideWhenUsed="1"/>
   </w:latentStyles>
   <w:style w:type="paragraph" w:default="1" w:styleId="Normal">
     <w:name w:val="Normal"/>
     <w:qFormat/>
   </w:style>
+  <w:style w:type="paragraph" w:styleId="Ttulo1">
+    <w:name w:val="heading 1"/>
+    <w:basedOn w:val="Normal"/>
+    <w:link w:val="Ttulo1Char"/>
+    <w:uiPriority w:val="9"/>
+    <w:qFormat/>
+    <w:rsid w:val="00F67C24"/>
+    <w:pPr>
+      <w:spacing w:before="100" w:beforeAutospacing="1" w:after="100" w:afterAutospacing="1" w:line="240" w:lineRule="auto"/>
+      <w:outlineLvl w:val="0"/>
+    </w:pPr>
+    <w:rPr>
+      <w:rFonts w:ascii="Times New Roman" w:eastAsia="Times New Roman" w:hAnsi="Times New Roman" w:cs="Times New Roman"/>
+      <w:b/>
+      <w:bCs/>
+      <w:kern w:val="36"/>
+      <w:sz w:val="48"/>
+      <w:szCs w:val="48"/>
+      <w:lang w:eastAsia="pt-BR"/>
+    </w:rPr>
+  </w:style>
   <w:style w:type="character" w:default="1" w:styleId="Fontepargpadro">
     <w:name w:val="Default Paragraph Font"/>
     <w:uiPriority w:val="1"/>
-    <w:semiHidden/>
     <w:unhideWhenUsed/>
   </w:style>
   <w:style w:type="table" w:default="1" w:styleId="Tabelanormal">
@@ -3063,8 +4031,8 @@
       <w:u w:val="single"/>
     </w:rPr>
   </w:style>
-  <w:style w:type="character" w:customStyle="1" w:styleId="UnresolvedMention">
-    <w:name w:val="Unresolved Mention"/>
+  <w:style w:type="character" w:customStyle="1" w:styleId="MenoPendente1">
+    <w:name w:val="Menção Pendente1"/>
     <w:basedOn w:val="Fontepargpadro"/>
     <w:uiPriority w:val="99"/>
     <w:semiHidden/>
@@ -3085,6 +4053,120 @@
     <w:rPr>
       <w:color w:val="954F72" w:themeColor="followedHyperlink"/>
       <w:u w:val="single"/>
+    </w:rPr>
+  </w:style>
+  <w:style w:type="character" w:customStyle="1" w:styleId="Ttulo1Char">
+    <w:name w:val="Título 1 Char"/>
+    <w:basedOn w:val="Fontepargpadro"/>
+    <w:link w:val="Ttulo1"/>
+    <w:uiPriority w:val="9"/>
+    <w:rsid w:val="00F67C24"/>
+    <w:rPr>
+      <w:rFonts w:ascii="Times New Roman" w:eastAsia="Times New Roman" w:hAnsi="Times New Roman" w:cs="Times New Roman"/>
+      <w:b/>
+      <w:bCs/>
+      <w:kern w:val="36"/>
+      <w:sz w:val="48"/>
+      <w:szCs w:val="48"/>
+      <w:lang w:eastAsia="pt-BR"/>
+    </w:rPr>
+  </w:style>
+  <w:style w:type="character" w:styleId="Refdecomentrio">
+    <w:name w:val="annotation reference"/>
+    <w:basedOn w:val="Fontepargpadro"/>
+    <w:uiPriority w:val="99"/>
+    <w:semiHidden/>
+    <w:unhideWhenUsed/>
+    <w:rsid w:val="00437250"/>
+    <w:rPr>
+      <w:sz w:val="16"/>
+      <w:szCs w:val="16"/>
+    </w:rPr>
+  </w:style>
+  <w:style w:type="paragraph" w:styleId="Textodecomentrio">
+    <w:name w:val="annotation text"/>
+    <w:basedOn w:val="Normal"/>
+    <w:link w:val="TextodecomentrioChar"/>
+    <w:uiPriority w:val="99"/>
+    <w:semiHidden/>
+    <w:unhideWhenUsed/>
+    <w:rsid w:val="00437250"/>
+    <w:pPr>
+      <w:spacing w:line="240" w:lineRule="auto"/>
+    </w:pPr>
+    <w:rPr>
+      <w:sz w:val="20"/>
+      <w:szCs w:val="20"/>
+    </w:rPr>
+  </w:style>
+  <w:style w:type="character" w:customStyle="1" w:styleId="TextodecomentrioChar">
+    <w:name w:val="Texto de comentário Char"/>
+    <w:basedOn w:val="Fontepargpadro"/>
+    <w:link w:val="Textodecomentrio"/>
+    <w:uiPriority w:val="99"/>
+    <w:semiHidden/>
+    <w:rsid w:val="00437250"/>
+    <w:rPr>
+      <w:sz w:val="20"/>
+      <w:szCs w:val="20"/>
+    </w:rPr>
+  </w:style>
+  <w:style w:type="paragraph" w:styleId="Assuntodocomentrio">
+    <w:name w:val="annotation subject"/>
+    <w:basedOn w:val="Textodecomentrio"/>
+    <w:next w:val="Textodecomentrio"/>
+    <w:link w:val="AssuntodocomentrioChar"/>
+    <w:uiPriority w:val="99"/>
+    <w:semiHidden/>
+    <w:unhideWhenUsed/>
+    <w:rsid w:val="00437250"/>
+    <w:rPr>
+      <w:b/>
+      <w:bCs/>
+    </w:rPr>
+  </w:style>
+  <w:style w:type="character" w:customStyle="1" w:styleId="AssuntodocomentrioChar">
+    <w:name w:val="Assunto do comentário Char"/>
+    <w:basedOn w:val="TextodecomentrioChar"/>
+    <w:link w:val="Assuntodocomentrio"/>
+    <w:uiPriority w:val="99"/>
+    <w:semiHidden/>
+    <w:rsid w:val="00437250"/>
+    <w:rPr>
+      <w:b/>
+      <w:bCs/>
+      <w:sz w:val="20"/>
+      <w:szCs w:val="20"/>
+    </w:rPr>
+  </w:style>
+  <w:style w:type="paragraph" w:styleId="Textodebalo">
+    <w:name w:val="Balloon Text"/>
+    <w:basedOn w:val="Normal"/>
+    <w:link w:val="TextodebaloChar"/>
+    <w:uiPriority w:val="99"/>
+    <w:semiHidden/>
+    <w:unhideWhenUsed/>
+    <w:rsid w:val="00437250"/>
+    <w:pPr>
+      <w:spacing w:after="0" w:line="240" w:lineRule="auto"/>
+    </w:pPr>
+    <w:rPr>
+      <w:rFonts w:ascii="Segoe UI" w:hAnsi="Segoe UI" w:cs="Segoe UI"/>
+      <w:sz w:val="18"/>
+      <w:szCs w:val="18"/>
+    </w:rPr>
+  </w:style>
+  <w:style w:type="character" w:customStyle="1" w:styleId="TextodebaloChar">
+    <w:name w:val="Texto de balão Char"/>
+    <w:basedOn w:val="Fontepargpadro"/>
+    <w:link w:val="Textodebalo"/>
+    <w:uiPriority w:val="99"/>
+    <w:semiHidden/>
+    <w:rsid w:val="00437250"/>
+    <w:rPr>
+      <w:rFonts w:ascii="Segoe UI" w:hAnsi="Segoe UI" w:cs="Segoe UI"/>
+      <w:sz w:val="18"/>
+      <w:szCs w:val="18"/>
     </w:rPr>
   </w:style>
 </w:styles>
@@ -3383,4 +4465,16 @@
     </a:ext>
   </a:extLst>
 </a:theme>
+</file>
+
+<file path=customXml/item1.xml><?xml version="1.0" encoding="utf-8"?>
+<b:Sources xmlns:b="http://schemas.openxmlformats.org/officeDocument/2006/bibliography" xmlns="http://schemas.openxmlformats.org/officeDocument/2006/bibliography" SelectedStyle="\APASixthEditionOfficeOnline.xsl" StyleName="APA" Version="6"/>
+</file>
+
+<file path=customXml/itemProps1.xml><?xml version="1.0" encoding="utf-8"?>
+<ds:datastoreItem xmlns:ds="http://schemas.openxmlformats.org/officeDocument/2006/customXml" ds:itemID="{1B2514FE-C49B-4682-ACAA-A25B80E63572}">
+  <ds:schemaRefs>
+    <ds:schemaRef ds:uri="http://schemas.openxmlformats.org/officeDocument/2006/bibliography"/>
+  </ds:schemaRefs>
+</ds:datastoreItem>
 </file>
</xml_diff>